<commit_message>
Reports: course title page (Done by / Checked by), Figure X.Y captions, original screenshots only; add Lab 2 Makefile
Co-Authored-By: Claude Opus 5.5 <noreply@anthropic.com>
Claude-Session: https://claude.ai/code/session_01MCWmHv1jmUGe6ZuEqYGPwj
</commit_message>
<xml_diff>
--- a/lab1/Lab1_BuligaVladislav_FAF-243.docx
+++ b/lab1/Lab1_BuligaVladislav_FAF-243.docx
@@ -274,7 +274,7 @@
           <w:szCs w:val="32"/>
           <w:lang w:val="en-GB" w:bidi="th-TH"/>
         </w:rPr>
-        <w:t>Buliga Vladislav FAF-243</w:t>
+        <w:t/>
       </w:r>
     </w:p>
     <w:p>
@@ -370,7 +370,7 @@
           <w:szCs w:val="40"/>
           <w:lang w:val="en-GB" w:bidi="th-TH"/>
         </w:rPr>
-        <w:t>Laboratory Work No.1</w:t>
+        <w:t>on laboratory work no. 1</w:t>
       </w:r>
     </w:p>
     <w:p>
@@ -470,7 +470,6 @@
         <w:autoSpaceDE w:val="0"/>
         <w:autoSpaceDN w:val="0"/>
         <w:adjustRightInd w:val="0"/>
-        <w:jc w:val="center"/>
         <w:rPr>
           <w:sz w:val="28"/>
           <w:szCs w:val="28"/>
@@ -480,61 +479,59 @@
     </w:p>
     <w:p>
       <w:pPr>
+        <w:pStyle w:val="Default"/>
+        <w:rPr>
+          <w:lang w:val="en-GB"/>
+        </w:rPr>
+      </w:pPr>
+    </w:p>
+    <w:p>
+      <w:pPr>
         <w:autoSpaceDE w:val="0"/>
         <w:autoSpaceDN w:val="0"/>
         <w:adjustRightInd w:val="0"/>
-        <w:jc w:val="center"/>
+        <w:jc w:val="right"/>
         <w:rPr>
           <w:sz w:val="28"/>
           <w:szCs w:val="28"/>
           <w:lang w:val="en-GB" w:bidi="th-TH"/>
         </w:rPr>
       </w:pPr>
+      <w:r>
+        <w:rPr>
+          <w:sz w:val="30"/>
+          <w:szCs w:val="30"/>
+          <w:lang w:val="en-GB"/>
+        </w:rPr>
+        <w:t>Done by:</w:t>
+      </w:r>
     </w:p>
     <w:p>
       <w:pPr>
         <w:autoSpaceDE w:val="0"/>
         <w:autoSpaceDN w:val="0"/>
         <w:adjustRightInd w:val="0"/>
-        <w:jc w:val="center"/>
+        <w:jc w:val="right"/>
         <w:rPr>
           <w:sz w:val="28"/>
           <w:szCs w:val="28"/>
           <w:lang w:val="en-GB" w:bidi="th-TH"/>
         </w:rPr>
       </w:pPr>
-    </w:p>
-    <w:p>
-      <w:pPr>
-        <w:autoSpaceDE w:val="0"/>
-        <w:autoSpaceDN w:val="0"/>
-        <w:adjustRightInd w:val="0"/>
-        <w:jc w:val="center"/>
-        <w:rPr>
+      <w:r>
+        <w:rPr>
+          <w:b/>
+          <w:bCs/>
           <w:sz w:val="28"/>
           <w:szCs w:val="28"/>
-          <w:lang w:val="en-GB" w:bidi="th-TH"/>
-        </w:rPr>
-      </w:pPr>
-    </w:p>
-    <w:p>
-      <w:pPr>
-        <w:autoSpaceDE w:val="0"/>
-        <w:autoSpaceDN w:val="0"/>
-        <w:adjustRightInd w:val="0"/>
-        <w:rPr>
-          <w:sz w:val="28"/>
-          <w:szCs w:val="28"/>
-          <w:lang w:val="en-GB" w:bidi="th-TH"/>
-        </w:rPr>
-      </w:pPr>
-    </w:p>
-    <w:p>
-      <w:pPr>
-        <w:pStyle w:val="Default"/>
-        <w:rPr>
           <w:lang w:val="en-GB"/>
         </w:rPr>
+        <w:t>st. gr. FAF-243, Buliga Vladislav</w:t>
+      </w:r>
+    </w:p>
+    <w:p>
+      <w:pPr>
+        <w:jc w:val="right"/>
       </w:pPr>
     </w:p>
     <w:p>
@@ -1248,7 +1245,7 @@
         <w:drawing>
           <wp:inline distT="0" distB="0" distL="0" distR="0">
             <wp:extent cx="5940000" cy="707945"/>
-            <wp:docPr id="101" name="Figure 1"/>
+            <wp:docPr id="101" name="Figure 0.1"/>
             <a:graphic xmlns:a="http://schemas.openxmlformats.org/drawingml/2006/main">
               <a:graphicData uri="http://schemas.openxmlformats.org/drawingml/2006/picture">
                 <pic:pic xmlns:pic="http://schemas.openxmlformats.org/drawingml/2006/picture">
@@ -1280,7 +1277,7 @@
     </w:p>
     <w:p>
       <w:pPr>
-        <w:spacing w:before="0" w:after="200" w:line="360" w:lineRule="auto"/>
+        <w:spacing w:before="60" w:after="200" w:line="360" w:lineRule="auto"/>
         <w:jc w:val="center"/>
       </w:pPr>
       <w:r>
@@ -1290,7 +1287,7 @@
           <w:sz w:val="22"/>
           <w:szCs w:val="22"/>
         </w:rPr>
-        <w:t xml:space="preserve">Figure 1. Output of whoami, uname -a and uptime</w:t>
+        <w:t xml:space="preserve">Figure 0.1 – Output of whoami, uname -a and uptime</w:t>
       </w:r>
     </w:p>
     <w:p>
@@ -1744,7 +1741,7 @@
         <w:drawing>
           <wp:inline distT="0" distB="0" distL="0" distR="0">
             <wp:extent cx="5850479" cy="7200000"/>
-            <wp:docPr id="102" name="Figure 2"/>
+            <wp:docPr id="102" name="Figure 1.1"/>
             <a:graphic xmlns:a="http://schemas.openxmlformats.org/drawingml/2006/main">
               <a:graphicData uri="http://schemas.openxmlformats.org/drawingml/2006/picture">
                 <pic:pic xmlns:pic="http://schemas.openxmlformats.org/drawingml/2006/picture">
@@ -1776,7 +1773,7 @@
     </w:p>
     <w:p>
       <w:pPr>
-        <w:spacing w:before="0" w:after="200" w:line="360" w:lineRule="auto"/>
+        <w:spacing w:before="60" w:after="200" w:line="360" w:lineRule="auto"/>
         <w:jc w:val="center"/>
       </w:pPr>
       <w:r>
@@ -1786,7 +1783,7 @@
           <w:sz w:val="22"/>
           <w:szCs w:val="22"/>
         </w:rPr>
-        <w:t xml:space="preserve">Figure 2. Contents of /, of the home directory and of /etc; the demo folder after cp and mv</w:t>
+        <w:t xml:space="preserve">Figure 1.1 – Contents of /, of the home directory and of /etc; the demo folder after cp and mv</w:t>
       </w:r>
     </w:p>
     <w:p>
@@ -2187,7 +2184,7 @@
         <w:drawing>
           <wp:inline distT="0" distB="0" distL="0" distR="0">
             <wp:extent cx="5940000" cy="7156717"/>
-            <wp:docPr id="103" name="Figure 3"/>
+            <wp:docPr id="103" name="Figure 2.1"/>
             <a:graphic xmlns:a="http://schemas.openxmlformats.org/drawingml/2006/main">
               <a:graphicData uri="http://schemas.openxmlformats.org/drawingml/2006/picture">
                 <pic:pic xmlns:pic="http://schemas.openxmlformats.org/drawingml/2006/picture">
@@ -2219,7 +2216,7 @@
     </w:p>
     <w:p>
       <w:pPr>
-        <w:spacing w:before="0" w:after="200" w:line="360" w:lineRule="auto"/>
+        <w:spacing w:before="60" w:after="200" w:line="360" w:lineRule="auto"/>
         <w:jc w:val="center"/>
       </w:pPr>
       <w:r>
@@ -2229,7 +2226,7 @@
           <w:sz w:val="22"/>
           <w:szCs w:val="22"/>
         </w:rPr>
-        <w:t xml:space="preserve">Figure 3. Live list of processes in top (PID 1 = systemd, 128 tasks)</w:t>
+        <w:t xml:space="preserve">Figure 2.1 – Live list of processes in top (PID 1 = systemd, 128 tasks)</w:t>
       </w:r>
     </w:p>
     <w:p>
@@ -2242,7 +2239,7 @@
         <w:drawing>
           <wp:inline distT="0" distB="0" distL="0" distR="0">
             <wp:extent cx="5940000" cy="2790775"/>
-            <wp:docPr id="104" name="Figure 4"/>
+            <wp:docPr id="104" name="Figure 2.2"/>
             <a:graphic xmlns:a="http://schemas.openxmlformats.org/drawingml/2006/main">
               <a:graphicData uri="http://schemas.openxmlformats.org/drawingml/2006/picture">
                 <pic:pic xmlns:pic="http://schemas.openxmlformats.org/drawingml/2006/picture">
@@ -2274,7 +2271,7 @@
     </w:p>
     <w:p>
       <w:pPr>
-        <w:spacing w:before="0" w:after="200" w:line="360" w:lineRule="auto"/>
+        <w:spacing w:before="60" w:after="200" w:line="360" w:lineRule="auto"/>
         <w:jc w:val="center"/>
       </w:pPr>
       <w:r>
@@ -2284,7 +2281,7 @@
           <w:sz w:val="22"/>
           <w:szCs w:val="22"/>
         </w:rPr>
-        <w:t xml:space="preserve">Figure 4. Background sleep process found with ps -ef, and its /proc/&lt;PID&gt;/status</w:t>
+        <w:t xml:space="preserve">Figure 2.2 – Background sleep process found with ps -ef, and its /proc/&lt;PID&gt;/status</w:t>
       </w:r>
     </w:p>
     <w:p>
@@ -2487,7 +2484,7 @@
         <w:drawing>
           <wp:inline distT="0" distB="0" distL="0" distR="0">
             <wp:extent cx="5638800" cy="2724150"/>
-            <wp:docPr id="105" name="Figure 5"/>
+            <wp:docPr id="105" name="Figure 3.1"/>
             <a:graphic xmlns:a="http://schemas.openxmlformats.org/drawingml/2006/main">
               <a:graphicData uri="http://schemas.openxmlformats.org/drawingml/2006/picture">
                 <pic:pic xmlns:pic="http://schemas.openxmlformats.org/drawingml/2006/picture">
@@ -2519,7 +2516,7 @@
     </w:p>
     <w:p>
       <w:pPr>
-        <w:spacing w:before="0" w:after="200" w:line="360" w:lineRule="auto"/>
+        <w:spacing w:before="60" w:after="200" w:line="360" w:lineRule="auto"/>
         <w:jc w:val="center"/>
       </w:pPr>
       <w:r>
@@ -2529,7 +2526,7 @@
           <w:sz w:val="22"/>
           <w:szCs w:val="22"/>
         </w:rPr>
-        <w:t xml:space="preserve">Figure 5. Output of free -h, /proc/meminfo and VmRSS of the sleep process</w:t>
+        <w:t xml:space="preserve">Figure 3.1 – Output of free -h, /proc/meminfo and VmRSS of the sleep process</w:t>
       </w:r>
     </w:p>
     <w:p>
@@ -2722,7 +2719,7 @@
         <w:drawing>
           <wp:inline distT="0" distB="0" distL="0" distR="0">
             <wp:extent cx="5940000" cy="5150818"/>
-            <wp:docPr id="106" name="Figure 6"/>
+            <wp:docPr id="106" name="Figure 4.1"/>
             <a:graphic xmlns:a="http://schemas.openxmlformats.org/drawingml/2006/main">
               <a:graphicData uri="http://schemas.openxmlformats.org/drawingml/2006/picture">
                 <pic:pic xmlns:pic="http://schemas.openxmlformats.org/drawingml/2006/picture">
@@ -2754,7 +2751,7 @@
     </w:p>
     <w:p>
       <w:pPr>
-        <w:spacing w:before="0" w:after="200" w:line="360" w:lineRule="auto"/>
+        <w:spacing w:before="60" w:after="200" w:line="360" w:lineRule="auto"/>
         <w:jc w:val="center"/>
       </w:pPr>
       <w:r>
@@ -2764,7 +2761,7 @@
           <w:sz w:val="22"/>
           <w:szCs w:val="22"/>
         </w:rPr>
-        <w:t xml:space="preserve">Figure 6. Output of df -h, lsblk, du, ls -l /dev and mount</w:t>
+        <w:t xml:space="preserve">Figure 4.1 – Output of df -h, lsblk, du, ls -l /dev and mount</w:t>
       </w:r>
     </w:p>
     <w:p>
@@ -2854,7 +2851,7 @@
         <w:drawing>
           <wp:inline distT="0" distB="0" distL="0" distR="0">
             <wp:extent cx="5940000" cy="4650621"/>
-            <wp:docPr id="107" name="Figure 7"/>
+            <wp:docPr id="107" name="Figure 5.1"/>
             <a:graphic xmlns:a="http://schemas.openxmlformats.org/drawingml/2006/main">
               <a:graphicData uri="http://schemas.openxmlformats.org/drawingml/2006/picture">
                 <pic:pic xmlns:pic="http://schemas.openxmlformats.org/drawingml/2006/picture">
@@ -2886,7 +2883,7 @@
     </w:p>
     <w:p>
       <w:pPr>
-        <w:spacing w:before="0" w:after="200" w:line="360" w:lineRule="auto"/>
+        <w:spacing w:before="60" w:after="200" w:line="360" w:lineRule="auto"/>
         <w:jc w:val="center"/>
       </w:pPr>
       <w:r>
@@ -2896,7 +2893,7 @@
           <w:sz w:val="22"/>
           <w:szCs w:val="22"/>
         </w:rPr>
-        <w:t xml:space="preserve">Figure 7. The interactive process viewer htop</w:t>
+        <w:t xml:space="preserve">Figure 5.1 – The interactive process viewer htop</w:t>
       </w:r>
     </w:p>
     <w:p>
@@ -2969,7 +2966,7 @@
         <w:drawing>
           <wp:inline distT="0" distB="0" distL="0" distR="0">
             <wp:extent cx="5791200" cy="4048125"/>
-            <wp:docPr id="108" name="Figure 8"/>
+            <wp:docPr id="108" name="Figure 5.2"/>
             <a:graphic xmlns:a="http://schemas.openxmlformats.org/drawingml/2006/main">
               <a:graphicData uri="http://schemas.openxmlformats.org/drawingml/2006/picture">
                 <pic:pic xmlns:pic="http://schemas.openxmlformats.org/drawingml/2006/picture">
@@ -3001,7 +2998,7 @@
     </w:p>
     <w:p>
       <w:pPr>
-        <w:spacing w:before="0" w:after="200" w:line="360" w:lineRule="auto"/>
+        <w:spacing w:before="60" w:after="200" w:line="360" w:lineRule="auto"/>
         <w:jc w:val="center"/>
       </w:pPr>
       <w:r>
@@ -3011,7 +3008,7 @@
           <w:sz w:val="22"/>
           <w:szCs w:val="22"/>
         </w:rPr>
-        <w:t xml:space="preserve">Figure 8. System calls made by ls, counted with strace -c</w:t>
+        <w:t xml:space="preserve">Figure 5.2 – System calls made by ls, counted with strace -c</w:t>
       </w:r>
     </w:p>
     <w:p>

</xml_diff>

<commit_message>
Update lab1: course title page, Figure X.Y captions, original screenshots
Co-Authored-By: Claude Opus 5.5 <noreply@anthropic.com>
Claude-Session: https://claude.ai/code/session_01MCWmHv1jmUGe6ZuEqYGPwj
</commit_message>
<xml_diff>
--- a/lab1/Lab1_BuligaVladislav_FAF-243.docx
+++ b/lab1/Lab1_BuligaVladislav_FAF-243.docx
@@ -274,7 +274,7 @@
           <w:szCs w:val="32"/>
           <w:lang w:val="en-GB" w:bidi="th-TH"/>
         </w:rPr>
-        <w:t>Buliga Vladislav FAF-243</w:t>
+        <w:t/>
       </w:r>
     </w:p>
     <w:p>
@@ -370,7 +370,7 @@
           <w:szCs w:val="40"/>
           <w:lang w:val="en-GB" w:bidi="th-TH"/>
         </w:rPr>
-        <w:t>Laboratory Work No.1</w:t>
+        <w:t>on laboratory work no. 1</w:t>
       </w:r>
     </w:p>
     <w:p>
@@ -470,7 +470,6 @@
         <w:autoSpaceDE w:val="0"/>
         <w:autoSpaceDN w:val="0"/>
         <w:adjustRightInd w:val="0"/>
-        <w:jc w:val="center"/>
         <w:rPr>
           <w:sz w:val="28"/>
           <w:szCs w:val="28"/>
@@ -480,61 +479,59 @@
     </w:p>
     <w:p>
       <w:pPr>
+        <w:pStyle w:val="Default"/>
+        <w:rPr>
+          <w:lang w:val="en-GB"/>
+        </w:rPr>
+      </w:pPr>
+    </w:p>
+    <w:p>
+      <w:pPr>
         <w:autoSpaceDE w:val="0"/>
         <w:autoSpaceDN w:val="0"/>
         <w:adjustRightInd w:val="0"/>
-        <w:jc w:val="center"/>
+        <w:jc w:val="right"/>
         <w:rPr>
           <w:sz w:val="28"/>
           <w:szCs w:val="28"/>
           <w:lang w:val="en-GB" w:bidi="th-TH"/>
         </w:rPr>
       </w:pPr>
+      <w:r>
+        <w:rPr>
+          <w:sz w:val="30"/>
+          <w:szCs w:val="30"/>
+          <w:lang w:val="en-GB"/>
+        </w:rPr>
+        <w:t>Done by:</w:t>
+      </w:r>
     </w:p>
     <w:p>
       <w:pPr>
         <w:autoSpaceDE w:val="0"/>
         <w:autoSpaceDN w:val="0"/>
         <w:adjustRightInd w:val="0"/>
-        <w:jc w:val="center"/>
+        <w:jc w:val="right"/>
         <w:rPr>
           <w:sz w:val="28"/>
           <w:szCs w:val="28"/>
           <w:lang w:val="en-GB" w:bidi="th-TH"/>
         </w:rPr>
       </w:pPr>
-    </w:p>
-    <w:p>
-      <w:pPr>
-        <w:autoSpaceDE w:val="0"/>
-        <w:autoSpaceDN w:val="0"/>
-        <w:adjustRightInd w:val="0"/>
-        <w:jc w:val="center"/>
-        <w:rPr>
+      <w:r>
+        <w:rPr>
+          <w:b/>
+          <w:bCs/>
           <w:sz w:val="28"/>
           <w:szCs w:val="28"/>
-          <w:lang w:val="en-GB" w:bidi="th-TH"/>
-        </w:rPr>
-      </w:pPr>
-    </w:p>
-    <w:p>
-      <w:pPr>
-        <w:autoSpaceDE w:val="0"/>
-        <w:autoSpaceDN w:val="0"/>
-        <w:adjustRightInd w:val="0"/>
-        <w:rPr>
-          <w:sz w:val="28"/>
-          <w:szCs w:val="28"/>
-          <w:lang w:val="en-GB" w:bidi="th-TH"/>
-        </w:rPr>
-      </w:pPr>
-    </w:p>
-    <w:p>
-      <w:pPr>
-        <w:pStyle w:val="Default"/>
-        <w:rPr>
           <w:lang w:val="en-GB"/>
         </w:rPr>
+        <w:t>st. gr. FAF-243, Buliga Vladislav</w:t>
+      </w:r>
+    </w:p>
+    <w:p>
+      <w:pPr>
+        <w:jc w:val="right"/>
       </w:pPr>
     </w:p>
     <w:p>
@@ -1248,7 +1245,7 @@
         <w:drawing>
           <wp:inline distT="0" distB="0" distL="0" distR="0">
             <wp:extent cx="5940000" cy="707945"/>
-            <wp:docPr id="101" name="Figure 1"/>
+            <wp:docPr id="101" name="Figure 0.1"/>
             <a:graphic xmlns:a="http://schemas.openxmlformats.org/drawingml/2006/main">
               <a:graphicData uri="http://schemas.openxmlformats.org/drawingml/2006/picture">
                 <pic:pic xmlns:pic="http://schemas.openxmlformats.org/drawingml/2006/picture">
@@ -1280,7 +1277,7 @@
     </w:p>
     <w:p>
       <w:pPr>
-        <w:spacing w:before="0" w:after="200" w:line="360" w:lineRule="auto"/>
+        <w:spacing w:before="60" w:after="200" w:line="360" w:lineRule="auto"/>
         <w:jc w:val="center"/>
       </w:pPr>
       <w:r>
@@ -1290,7 +1287,7 @@
           <w:sz w:val="22"/>
           <w:szCs w:val="22"/>
         </w:rPr>
-        <w:t xml:space="preserve">Figure 1. Output of whoami, uname -a and uptime</w:t>
+        <w:t xml:space="preserve">Figure 0.1 – Output of whoami, uname -a and uptime</w:t>
       </w:r>
     </w:p>
     <w:p>
@@ -1744,7 +1741,7 @@
         <w:drawing>
           <wp:inline distT="0" distB="0" distL="0" distR="0">
             <wp:extent cx="5850479" cy="7200000"/>
-            <wp:docPr id="102" name="Figure 2"/>
+            <wp:docPr id="102" name="Figure 1.1"/>
             <a:graphic xmlns:a="http://schemas.openxmlformats.org/drawingml/2006/main">
               <a:graphicData uri="http://schemas.openxmlformats.org/drawingml/2006/picture">
                 <pic:pic xmlns:pic="http://schemas.openxmlformats.org/drawingml/2006/picture">
@@ -1776,7 +1773,7 @@
     </w:p>
     <w:p>
       <w:pPr>
-        <w:spacing w:before="0" w:after="200" w:line="360" w:lineRule="auto"/>
+        <w:spacing w:before="60" w:after="200" w:line="360" w:lineRule="auto"/>
         <w:jc w:val="center"/>
       </w:pPr>
       <w:r>
@@ -1786,7 +1783,7 @@
           <w:sz w:val="22"/>
           <w:szCs w:val="22"/>
         </w:rPr>
-        <w:t xml:space="preserve">Figure 2. Contents of /, of the home directory and of /etc; the demo folder after cp and mv</w:t>
+        <w:t xml:space="preserve">Figure 1.1 – Contents of /, of the home directory and of /etc; the demo folder after cp and mv</w:t>
       </w:r>
     </w:p>
     <w:p>
@@ -2187,7 +2184,7 @@
         <w:drawing>
           <wp:inline distT="0" distB="0" distL="0" distR="0">
             <wp:extent cx="5940000" cy="7156717"/>
-            <wp:docPr id="103" name="Figure 3"/>
+            <wp:docPr id="103" name="Figure 2.1"/>
             <a:graphic xmlns:a="http://schemas.openxmlformats.org/drawingml/2006/main">
               <a:graphicData uri="http://schemas.openxmlformats.org/drawingml/2006/picture">
                 <pic:pic xmlns:pic="http://schemas.openxmlformats.org/drawingml/2006/picture">
@@ -2219,7 +2216,7 @@
     </w:p>
     <w:p>
       <w:pPr>
-        <w:spacing w:before="0" w:after="200" w:line="360" w:lineRule="auto"/>
+        <w:spacing w:before="60" w:after="200" w:line="360" w:lineRule="auto"/>
         <w:jc w:val="center"/>
       </w:pPr>
       <w:r>
@@ -2229,7 +2226,7 @@
           <w:sz w:val="22"/>
           <w:szCs w:val="22"/>
         </w:rPr>
-        <w:t xml:space="preserve">Figure 3. Live list of processes in top (PID 1 = systemd, 128 tasks)</w:t>
+        <w:t xml:space="preserve">Figure 2.1 – Live list of processes in top (PID 1 = systemd, 128 tasks)</w:t>
       </w:r>
     </w:p>
     <w:p>
@@ -2242,7 +2239,7 @@
         <w:drawing>
           <wp:inline distT="0" distB="0" distL="0" distR="0">
             <wp:extent cx="5940000" cy="2790775"/>
-            <wp:docPr id="104" name="Figure 4"/>
+            <wp:docPr id="104" name="Figure 2.2"/>
             <a:graphic xmlns:a="http://schemas.openxmlformats.org/drawingml/2006/main">
               <a:graphicData uri="http://schemas.openxmlformats.org/drawingml/2006/picture">
                 <pic:pic xmlns:pic="http://schemas.openxmlformats.org/drawingml/2006/picture">
@@ -2274,7 +2271,7 @@
     </w:p>
     <w:p>
       <w:pPr>
-        <w:spacing w:before="0" w:after="200" w:line="360" w:lineRule="auto"/>
+        <w:spacing w:before="60" w:after="200" w:line="360" w:lineRule="auto"/>
         <w:jc w:val="center"/>
       </w:pPr>
       <w:r>
@@ -2284,7 +2281,7 @@
           <w:sz w:val="22"/>
           <w:szCs w:val="22"/>
         </w:rPr>
-        <w:t xml:space="preserve">Figure 4. Background sleep process found with ps -ef, and its /proc/&lt;PID&gt;/status</w:t>
+        <w:t xml:space="preserve">Figure 2.2 – Background sleep process found with ps -ef, and its /proc/&lt;PID&gt;/status</w:t>
       </w:r>
     </w:p>
     <w:p>
@@ -2487,7 +2484,7 @@
         <w:drawing>
           <wp:inline distT="0" distB="0" distL="0" distR="0">
             <wp:extent cx="5638800" cy="2724150"/>
-            <wp:docPr id="105" name="Figure 5"/>
+            <wp:docPr id="105" name="Figure 3.1"/>
             <a:graphic xmlns:a="http://schemas.openxmlformats.org/drawingml/2006/main">
               <a:graphicData uri="http://schemas.openxmlformats.org/drawingml/2006/picture">
                 <pic:pic xmlns:pic="http://schemas.openxmlformats.org/drawingml/2006/picture">
@@ -2519,7 +2516,7 @@
     </w:p>
     <w:p>
       <w:pPr>
-        <w:spacing w:before="0" w:after="200" w:line="360" w:lineRule="auto"/>
+        <w:spacing w:before="60" w:after="200" w:line="360" w:lineRule="auto"/>
         <w:jc w:val="center"/>
       </w:pPr>
       <w:r>
@@ -2529,7 +2526,7 @@
           <w:sz w:val="22"/>
           <w:szCs w:val="22"/>
         </w:rPr>
-        <w:t xml:space="preserve">Figure 5. Output of free -h, /proc/meminfo and VmRSS of the sleep process</w:t>
+        <w:t xml:space="preserve">Figure 3.1 – Output of free -h, /proc/meminfo and VmRSS of the sleep process</w:t>
       </w:r>
     </w:p>
     <w:p>
@@ -2722,7 +2719,7 @@
         <w:drawing>
           <wp:inline distT="0" distB="0" distL="0" distR="0">
             <wp:extent cx="5940000" cy="5150818"/>
-            <wp:docPr id="106" name="Figure 6"/>
+            <wp:docPr id="106" name="Figure 4.1"/>
             <a:graphic xmlns:a="http://schemas.openxmlformats.org/drawingml/2006/main">
               <a:graphicData uri="http://schemas.openxmlformats.org/drawingml/2006/picture">
                 <pic:pic xmlns:pic="http://schemas.openxmlformats.org/drawingml/2006/picture">
@@ -2754,7 +2751,7 @@
     </w:p>
     <w:p>
       <w:pPr>
-        <w:spacing w:before="0" w:after="200" w:line="360" w:lineRule="auto"/>
+        <w:spacing w:before="60" w:after="200" w:line="360" w:lineRule="auto"/>
         <w:jc w:val="center"/>
       </w:pPr>
       <w:r>
@@ -2764,7 +2761,7 @@
           <w:sz w:val="22"/>
           <w:szCs w:val="22"/>
         </w:rPr>
-        <w:t xml:space="preserve">Figure 6. Output of df -h, lsblk, du, ls -l /dev and mount</w:t>
+        <w:t xml:space="preserve">Figure 4.1 – Output of df -h, lsblk, du, ls -l /dev and mount</w:t>
       </w:r>
     </w:p>
     <w:p>
@@ -2854,7 +2851,7 @@
         <w:drawing>
           <wp:inline distT="0" distB="0" distL="0" distR="0">
             <wp:extent cx="5940000" cy="4650621"/>
-            <wp:docPr id="107" name="Figure 7"/>
+            <wp:docPr id="107" name="Figure 5.1"/>
             <a:graphic xmlns:a="http://schemas.openxmlformats.org/drawingml/2006/main">
               <a:graphicData uri="http://schemas.openxmlformats.org/drawingml/2006/picture">
                 <pic:pic xmlns:pic="http://schemas.openxmlformats.org/drawingml/2006/picture">
@@ -2886,7 +2883,7 @@
     </w:p>
     <w:p>
       <w:pPr>
-        <w:spacing w:before="0" w:after="200" w:line="360" w:lineRule="auto"/>
+        <w:spacing w:before="60" w:after="200" w:line="360" w:lineRule="auto"/>
         <w:jc w:val="center"/>
       </w:pPr>
       <w:r>
@@ -2896,7 +2893,7 @@
           <w:sz w:val="22"/>
           <w:szCs w:val="22"/>
         </w:rPr>
-        <w:t xml:space="preserve">Figure 7. The interactive process viewer htop</w:t>
+        <w:t xml:space="preserve">Figure 5.1 – The interactive process viewer htop</w:t>
       </w:r>
     </w:p>
     <w:p>
@@ -2969,7 +2966,7 @@
         <w:drawing>
           <wp:inline distT="0" distB="0" distL="0" distR="0">
             <wp:extent cx="5791200" cy="4048125"/>
-            <wp:docPr id="108" name="Figure 8"/>
+            <wp:docPr id="108" name="Figure 5.2"/>
             <a:graphic xmlns:a="http://schemas.openxmlformats.org/drawingml/2006/main">
               <a:graphicData uri="http://schemas.openxmlformats.org/drawingml/2006/picture">
                 <pic:pic xmlns:pic="http://schemas.openxmlformats.org/drawingml/2006/picture">
@@ -3001,7 +2998,7 @@
     </w:p>
     <w:p>
       <w:pPr>
-        <w:spacing w:before="0" w:after="200" w:line="360" w:lineRule="auto"/>
+        <w:spacing w:before="60" w:after="200" w:line="360" w:lineRule="auto"/>
         <w:jc w:val="center"/>
       </w:pPr>
       <w:r>
@@ -3011,7 +3008,7 @@
           <w:sz w:val="22"/>
           <w:szCs w:val="22"/>
         </w:rPr>
-        <w:t xml:space="preserve">Figure 8. System calls made by ls, counted with strace -c</w:t>
+        <w:t xml:space="preserve">Figure 5.2 – System calls made by ls, counted with strace -c</w:t>
       </w:r>
     </w:p>
     <w:p>

</xml_diff>